<commit_message>
Microservicios & Domain Design DDD
</commit_message>
<xml_diff>
--- a/Evaluaciones/Evaluación2_Arquitectura de Software.docx
+++ b/Evaluaciones/Evaluación2_Arquitectura de Software.docx
@@ -16,8 +16,17 @@
           <w:b/>
           <w:bCs/>
         </w:rPr>
-        <w:t>Evaluación 2 Arquitectura de  Software</w:t>
-      </w:r>
+        <w:t xml:space="preserve">Evaluación 2 Arquitectura </w:t>
+      </w:r>
+      <w:proofErr w:type="gramStart"/>
+      <w:r>
+        <w:rPr>
+          <w:b/>
+          <w:bCs/>
+        </w:rPr>
+        <w:t>de  Software</w:t>
+      </w:r>
+      <w:proofErr w:type="gramEnd"/>
     </w:p>
     <w:p>
       <w:pPr>
@@ -615,7 +624,21 @@
         <w:rPr>
           <w:lang w:val="es-ES"/>
         </w:rPr>
-        <w:t xml:space="preserve">, por lo tanto una descripción </w:t>
+        <w:t xml:space="preserve">, por lo </w:t>
+      </w:r>
+      <w:proofErr w:type="gramStart"/>
+      <w:r>
+        <w:rPr>
+          <w:lang w:val="es-ES"/>
+        </w:rPr>
+        <w:t>tanto</w:t>
+      </w:r>
+      <w:proofErr w:type="gramEnd"/>
+      <w:r>
+        <w:rPr>
+          <w:lang w:val="es-ES"/>
+        </w:rPr>
+        <w:t xml:space="preserve"> una descripción </w:t>
       </w:r>
       <w:r>
         <w:rPr>
@@ -1847,8 +1870,8 @@
                 <w:b/>
                 <w:bCs/>
                 <w:color w:val="0F1115"/>
-                <w:sz w:val="16"/>
-                <w:szCs w:val="16"/>
+                <w:sz w:val="14"/>
+                <w:szCs w:val="14"/>
                 <w:lang w:eastAsia="es-419"/>
               </w:rPr>
               <w:lastRenderedPageBreak/>
@@ -2376,7 +2399,29 @@
                 <w:szCs w:val="16"/>
                 <w:lang w:eastAsia="es-419"/>
               </w:rPr>
-              <w:t>El diagrama está presente pero es confuso, con elementos desordenados o notación inconsistente.</w:t>
+              <w:t xml:space="preserve">El diagrama está </w:t>
+            </w:r>
+            <w:proofErr w:type="gramStart"/>
+            <w:r>
+              <w:rPr>
+                <w:rFonts w:ascii="Calibri Light" w:eastAsia="Times New Roman" w:hAnsi="Calibri Light" w:cs="Calibri Light"/>
+                <w:color w:val="0F1115"/>
+                <w:sz w:val="16"/>
+                <w:szCs w:val="16"/>
+                <w:lang w:eastAsia="es-419"/>
+              </w:rPr>
+              <w:t>presente</w:t>
+            </w:r>
+            <w:proofErr w:type="gramEnd"/>
+            <w:r>
+              <w:rPr>
+                <w:rFonts w:ascii="Calibri Light" w:eastAsia="Times New Roman" w:hAnsi="Calibri Light" w:cs="Calibri Light"/>
+                <w:color w:val="0F1115"/>
+                <w:sz w:val="16"/>
+                <w:szCs w:val="16"/>
+                <w:lang w:eastAsia="es-419"/>
+              </w:rPr>
+              <w:t xml:space="preserve"> pero es confuso, con elementos desordenados o notación inconsistente.</w:t>
             </w:r>
           </w:p>
         </w:tc>
@@ -3238,7 +3283,29 @@
                 <w:szCs w:val="16"/>
                 <w:lang w:eastAsia="es-419"/>
               </w:rPr>
-              <w:t>Todos los componentes están presentes y la implementación es incluso más robusta de lo descrito, manejando casos borde o con una mejor integración entre ellos.</w:t>
+              <w:t xml:space="preserve">Todos los componentes están presentes y la implementación es incluso más robusta de lo descrito, manejando </w:t>
+            </w:r>
+            <w:proofErr w:type="gramStart"/>
+            <w:r>
+              <w:rPr>
+                <w:rFonts w:ascii="Calibri Light" w:eastAsia="Times New Roman" w:hAnsi="Calibri Light" w:cs="Calibri Light"/>
+                <w:color w:val="0F1115"/>
+                <w:sz w:val="16"/>
+                <w:szCs w:val="16"/>
+                <w:lang w:eastAsia="es-419"/>
+              </w:rPr>
+              <w:t>casos borde</w:t>
+            </w:r>
+            <w:proofErr w:type="gramEnd"/>
+            <w:r>
+              <w:rPr>
+                <w:rFonts w:ascii="Calibri Light" w:eastAsia="Times New Roman" w:hAnsi="Calibri Light" w:cs="Calibri Light"/>
+                <w:color w:val="0F1115"/>
+                <w:sz w:val="16"/>
+                <w:szCs w:val="16"/>
+                <w:lang w:eastAsia="es-419"/>
+              </w:rPr>
+              <w:t xml:space="preserve"> o con una mejor integración entre ellos.</w:t>
             </w:r>
           </w:p>
         </w:tc>

</xml_diff>